<commit_message>
Finish Johnny champion doc and add PDF
</commit_message>
<xml_diff>
--- a/doc/johnny/Johnny_Champion/johnny_champion.docx
+++ b/doc/johnny/Johnny_Champion/johnny_champion.docx
@@ -4163,6 +4163,7 @@
         <w:ind w:left="720"/>
       </w:pPr>
       <w:r>
+        <w:lastRenderedPageBreak/>
         <w:t>Gantt timeline</w:t>
       </w:r>
     </w:p>
@@ -4172,10 +4173,10 @@
           <w:noProof/>
         </w:rPr>
         <w:drawing>
-          <wp:inline distT="0" distB="0" distL="0" distR="0" wp14:anchorId="30E00E66" wp14:editId="1E953A78">
-            <wp:extent cx="5943600" cy="2810344"/>
+          <wp:inline distT="0" distB="0" distL="0" distR="0" wp14:anchorId="2F8A68E3" wp14:editId="7F6E15A1">
+            <wp:extent cx="5943600" cy="3962400"/>
             <wp:effectExtent l="0" t="0" r="0" b="0"/>
-            <wp:docPr id="5" name="Picture 5"/>
+            <wp:docPr id="1401032014" name="Picture 1"/>
             <wp:cNvGraphicFramePr>
               <a:graphicFrameLocks xmlns:a="http://schemas.openxmlformats.org/drawingml/2006/main" noChangeAspect="1"/>
             </wp:cNvGraphicFramePr>
@@ -4183,19 +4184,25 @@
               <a:graphicData uri="http://schemas.openxmlformats.org/drawingml/2006/picture">
                 <pic:pic xmlns:pic="http://schemas.openxmlformats.org/drawingml/2006/picture">
                   <pic:nvPicPr>
-                    <pic:cNvPr id="870343972" name=""/>
-                    <pic:cNvPicPr>
-                      <a:picLocks noChangeAspect="1"/>
-                    </pic:cNvPicPr>
+                    <pic:cNvPr id="1401032014" name="Picture 1401032014"/>
+                    <pic:cNvPicPr/>
                   </pic:nvPicPr>
-                  <pic:blipFill rotWithShape="1">
-                    <a:blip r:embed="rId12"/>
-                    <a:stretch/>
+                  <pic:blipFill>
+                    <a:blip r:embed="rId12">
+                      <a:extLst>
+                        <a:ext uri="{28A0092B-C50C-407E-A947-70E740481C1C}">
+                          <a14:useLocalDpi xmlns:a14="http://schemas.microsoft.com/office/drawing/2010/main" val="0"/>
+                        </a:ext>
+                      </a:extLst>
+                    </a:blip>
+                    <a:stretch>
+                      <a:fillRect/>
+                    </a:stretch>
                   </pic:blipFill>
-                  <pic:spPr bwMode="auto">
+                  <pic:spPr>
                     <a:xfrm>
                       <a:off x="0" y="0"/>
-                      <a:ext cx="5943599" cy="2810343"/>
+                      <a:ext cx="5943600" cy="3962400"/>
                     </a:xfrm>
                     <a:prstGeom prst="rect">
                       <a:avLst/>
@@ -5275,6 +5282,7 @@
   <w:style w:type="character" w:default="1" w:styleId="DefaultParagraphFont">
     <w:name w:val="Default Paragraph Font"/>
     <w:uiPriority w:val="1"/>
+    <w:semiHidden/>
     <w:unhideWhenUsed/>
   </w:style>
   <w:style w:type="table" w:default="1" w:styleId="TableNormal">

</xml_diff>